<commit_message>
finale Korrekturen MK vor Abschicken an FS
</commit_message>
<xml_diff>
--- a/lh3/feinkonzept/DURCHBLICKT_LH3_Mythen_Arbeitsblätter.docx
+++ b/lh3/feinkonzept/DURCHBLICKT_LH3_Mythen_Arbeitsblätter.docx
@@ -6348,7 +6348,30 @@
           <w:color w:val="000000" w:themeColor="text1"/>
         </w:rPr>
         <w:lastRenderedPageBreak/>
-        <w:t>AB 4: Drei fiktive Influencer-Profile</w:t>
+        <w:t xml:space="preserve">AB 4: </w:t>
+      </w:r>
+      <w:commentRangeStart w:id="2"/>
+      <w:r>
+        <w:rPr>
+          <w:rFonts w:cstheme="minorHAnsi"/>
+          <w:b/>
+          <w:bCs/>
+          <w:color w:val="000000" w:themeColor="text1"/>
+        </w:rPr>
+        <w:t>Drei fiktive Influencer-Profile</w:t>
+      </w:r>
+      <w:commentRangeEnd w:id="2"/>
+      <w:r>
+        <w:rPr>
+          <w:rStyle w:val="Kommentarzeichen"/>
+          <w:rFonts w:cstheme="minorHAnsi"/>
+          <w:b/>
+          <w:bCs/>
+          <w:color w:val="000000" w:themeColor="text1"/>
+          <w:sz w:val="22"/>
+          <w:szCs w:val="22"/>
+        </w:rPr>
+        <w:commentReference w:id="2"/>
       </w:r>
     </w:p>
     <w:p>
@@ -11265,7 +11288,7 @@
           <w:color w:val="000000" w:themeColor="text1"/>
         </w:rPr>
       </w:pPr>
-      <w:commentRangeStart w:id="2"/>
+      <w:commentRangeStart w:id="3"/>
       <w:r>
         <w:rPr>
           <w:rFonts w:cstheme="minorHAnsi"/>
@@ -11275,7 +11298,7 @@
         </w:rPr>
         <w:t>Lena und das Wundergetränk</w:t>
       </w:r>
-      <w:commentRangeEnd w:id="2"/>
+      <w:commentRangeEnd w:id="3"/>
       <w:r>
         <w:rPr>
           <w:rStyle w:val="Kommentarzeichen"/>
@@ -11286,7 +11309,7 @@
           <w:sz w:val="22"/>
           <w:szCs w:val="22"/>
         </w:rPr>
-        <w:commentReference w:id="2"/>
+        <w:commentReference w:id="3"/>
       </w:r>
     </w:p>
     <w:p>
@@ -11386,7 +11409,7 @@
           <w:color w:val="000000" w:themeColor="text1"/>
         </w:rPr>
       </w:pPr>
-      <w:commentRangeStart w:id="3"/>
+      <w:commentRangeStart w:id="4"/>
       <w:r>
         <w:rPr>
           <w:rFonts w:cstheme="minorHAnsi"/>
@@ -11394,7 +11417,7 @@
         </w:rPr>
         <w:t>Aber stimmt das eigentlich überhaupt, was Lena im Video gesehen hat? Hat irgendjemand nachgefragt? Die Frau im Video, Lena, Mia, die Mutter, der kleine Bruder? Wer hätte fragen können – und bei wem?</w:t>
       </w:r>
-      <w:commentRangeEnd w:id="3"/>
+      <w:commentRangeEnd w:id="4"/>
       <w:r>
         <w:rPr>
           <w:rStyle w:val="Kommentarzeichen"/>
@@ -11403,7 +11426,7 @@
           <w:sz w:val="22"/>
           <w:szCs w:val="22"/>
         </w:rPr>
-        <w:commentReference w:id="3"/>
+        <w:commentReference w:id="4"/>
       </w:r>
     </w:p>
     <w:p>
@@ -12978,7 +13001,7 @@
       </w:r>
     </w:p>
   </w:comment>
-  <w:comment w:id="2" w:author="Michael Kohl" w:date="2026-05-06T16:19:00Z" w:initials="MK">
+  <w:comment w:id="2" w:author="Michael Kohl" w:date="2026-05-08T07:51:00Z" w:initials="MK">
     <w:p>
       <w:pPr>
         <w:pStyle w:val="Kommentartext"/>
@@ -12990,11 +13013,27 @@
         <w:annotationRef/>
       </w:r>
       <w:r>
-        <w:t>Als Bildergeschichte noch aufbereiten?</w:t>
+        <w:t>In Anhang 1 sind ein paar Trigger-Vermeidungs-Infos...sind die Profile auf AB4 OK in dieser Hinsicht?</w:t>
       </w:r>
     </w:p>
   </w:comment>
   <w:comment w:id="3" w:author="Michael Kohl" w:date="2026-05-06T16:19:00Z" w:initials="MK">
+    <w:p>
+      <w:pPr>
+        <w:pStyle w:val="Kommentartext"/>
+      </w:pPr>
+      <w:r>
+        <w:rPr>
+          <w:rStyle w:val="Kommentarzeichen"/>
+        </w:rPr>
+        <w:annotationRef/>
+      </w:r>
+      <w:r>
+        <w:t>Als Bildergeschichte noch aufbereiten?</w:t>
+      </w:r>
+    </w:p>
+  </w:comment>
+  <w:comment w:id="4" w:author="Michael Kohl" w:date="2026-05-06T16:19:00Z" w:initials="MK">
     <w:p>
       <w:pPr>
         <w:pStyle w:val="Kommentartext"/>
@@ -13016,6 +13055,7 @@
 <file path=word/commentsExtended.xml><?xml version="1.0" encoding="utf-8"?>
 <w15:commentsEx xmlns:wpc="http://schemas.microsoft.com/office/word/2010/wordprocessingCanvas" xmlns:cx="http://schemas.microsoft.com/office/drawing/2014/chartex" xmlns:cx1="http://schemas.microsoft.com/office/drawing/2015/9/8/chartex" xmlns:cx2="http://schemas.microsoft.com/office/drawing/2015/10/21/chartex" xmlns:cx3="http://schemas.microsoft.com/office/drawing/2016/5/9/chartex" xmlns:cx4="http://schemas.microsoft.com/office/drawing/2016/5/10/chartex" xmlns:cx5="http://schemas.microsoft.com/office/drawing/2016/5/11/chartex" xmlns:cx6="http://schemas.microsoft.com/office/drawing/2016/5/12/chartex" xmlns:cx7="http://schemas.microsoft.com/office/drawing/2016/5/13/chartex" xmlns:cx8="http://schemas.microsoft.com/office/drawing/2016/5/14/chartex" xmlns:mc="http://schemas.openxmlformats.org/markup-compatibility/2006" xmlns:aink="http://schemas.microsoft.com/office/drawing/2016/ink" xmlns:am3d="http://schemas.microsoft.com/office/drawing/2017/model3d" xmlns:o="urn:schemas-microsoft-com:office:office" xmlns:oel="http://schemas.microsoft.com/office/2019/extlst" xmlns:r="http://schemas.openxmlformats.org/officeDocument/2006/relationships" xmlns:m="http://schemas.openxmlformats.org/officeDocument/2006/math" xmlns:v="urn:schemas-microsoft-com:vml" xmlns:wp14="http://schemas.microsoft.com/office/word/2010/wordprocessingDrawing" xmlns:wp="http://schemas.openxmlformats.org/drawingml/2006/wordprocessingDrawing" xmlns:w10="urn:schemas-microsoft-com:office:word" xmlns:w="http://schemas.openxmlformats.org/wordprocessingml/2006/main" xmlns:w14="http://schemas.microsoft.com/office/word/2010/wordml" xmlns:w15="http://schemas.microsoft.com/office/word/2012/wordml" xmlns:w16cex="http://schemas.microsoft.com/office/word/2018/wordml/cex" xmlns:w16cid="http://schemas.microsoft.com/office/word/2016/wordml/cid" xmlns:w16="http://schemas.microsoft.com/office/word/2018/wordml" xmlns:w16du="http://schemas.microsoft.com/office/word/2023/wordml/word16du" xmlns:w16sdtdh="http://schemas.microsoft.com/office/word/2020/wordml/sdtdatahash" xmlns:w16sdtfl="http://schemas.microsoft.com/office/word/2024/wordml/sdtformatlock" xmlns:w16se="http://schemas.microsoft.com/office/word/2015/wordml/symex" xmlns:wpg="http://schemas.microsoft.com/office/word/2010/wordprocessingGroup" xmlns:wpi="http://schemas.microsoft.com/office/word/2010/wordprocessingInk" xmlns:wne="http://schemas.microsoft.com/office/word/2006/wordml" xmlns:wps="http://schemas.microsoft.com/office/word/2010/wordprocessingShape" mc:Ignorable="w14 w15 w16se w16cid w16 w16cex w16sdtdh w16sdtfl w16du wp14">
   <w15:commentEx w15:paraId="70AB9F2B" w15:done="0"/>
+  <w15:commentEx w15:paraId="02791D38" w15:done="0"/>
   <w15:commentEx w15:paraId="1EBBB4BC" w15:done="0"/>
   <w15:commentEx w15:paraId="65320F05" w15:done="0"/>
 </w15:commentsEx>
@@ -13024,6 +13064,7 @@
 <file path=word/commentsExtensible.xml><?xml version="1.0" encoding="utf-8"?>
 <w16cex:commentsExtensible xmlns:wpc="http://schemas.microsoft.com/office/word/2010/wordprocessingCanvas" xmlns:cx="http://schemas.microsoft.com/office/drawing/2014/chartex" xmlns:cx1="http://schemas.microsoft.com/office/drawing/2015/9/8/chartex" xmlns:cx2="http://schemas.microsoft.com/office/drawing/2015/10/21/chartex" xmlns:cx3="http://schemas.microsoft.com/office/drawing/2016/5/9/chartex" xmlns:cx4="http://schemas.microsoft.com/office/drawing/2016/5/10/chartex" xmlns:cx5="http://schemas.microsoft.com/office/drawing/2016/5/11/chartex" xmlns:cx6="http://schemas.microsoft.com/office/drawing/2016/5/12/chartex" xmlns:cx7="http://schemas.microsoft.com/office/drawing/2016/5/13/chartex" xmlns:cx8="http://schemas.microsoft.com/office/drawing/2016/5/14/chartex" xmlns:cr="http://schemas.microsoft.com/office/comments/2020/reactions" xmlns:mc="http://schemas.openxmlformats.org/markup-compatibility/2006" xmlns:aink="http://schemas.microsoft.com/office/drawing/2016/ink" xmlns:am3d="http://schemas.microsoft.com/office/drawing/2017/model3d" xmlns:o="urn:schemas-microsoft-com:office:office" xmlns:oel="http://schemas.microsoft.com/office/2019/extlst" xmlns:r="http://schemas.openxmlformats.org/officeDocument/2006/relationships" xmlns:m="http://schemas.openxmlformats.org/officeDocument/2006/math" xmlns:v="urn:schemas-microsoft-com:vml" xmlns:wp14="http://schemas.microsoft.com/office/word/2010/wordprocessingDrawing" xmlns:wp="http://schemas.openxmlformats.org/drawingml/2006/wordprocessingDrawing" xmlns:w10="urn:schemas-microsoft-com:office:word" xmlns:w="http://schemas.openxmlformats.org/wordprocessingml/2006/main" xmlns:w14="http://schemas.microsoft.com/office/word/2010/wordml" xmlns:w15="http://schemas.microsoft.com/office/word/2012/wordml" xmlns:w16cex="http://schemas.microsoft.com/office/word/2018/wordml/cex" xmlns:w16cid="http://schemas.microsoft.com/office/word/2016/wordml/cid" xmlns:w16="http://schemas.microsoft.com/office/word/2018/wordml" xmlns:w16du="http://schemas.microsoft.com/office/word/2023/wordml/word16du" xmlns:w16sdtdh="http://schemas.microsoft.com/office/word/2020/wordml/sdtdatahash" xmlns:w16sdtfl="http://schemas.microsoft.com/office/word/2024/wordml/sdtformatlock" xmlns:w16se="http://schemas.microsoft.com/office/word/2015/wordml/symex" xmlns:wpg="http://schemas.microsoft.com/office/word/2010/wordprocessingGroup" xmlns:wpi="http://schemas.microsoft.com/office/word/2010/wordprocessingInk" xmlns:wne="http://schemas.microsoft.com/office/word/2006/wordml" xmlns:wps="http://schemas.microsoft.com/office/word/2010/wordprocessingShape" mc:Ignorable="w14 w15 w16se w16cid w16 w16cex w16sdtdh w16sdtfl cr w16du wp14">
   <w16cex:commentExtensible w16cex:durableId="622E673C" w16cex:dateUtc="2026-05-05T13:31:00Z"/>
+  <w16cex:commentExtensible w16cex:durableId="50345F35" w16cex:dateUtc="2026-05-08T05:51:00Z"/>
   <w16cex:commentExtensible w16cex:durableId="74002062" w16cex:dateUtc="2026-05-06T14:19:00Z"/>
   <w16cex:commentExtensible w16cex:durableId="6A4F022F" w16cex:dateUtc="2026-05-06T14:19:00Z"/>
 </w16cex:commentsExtensible>
@@ -13032,6 +13073,7 @@
 <file path=word/commentsIds.xml><?xml version="1.0" encoding="utf-8"?>
 <w16cid:commentsIds xmlns:wpc="http://schemas.microsoft.com/office/word/2010/wordprocessingCanvas" xmlns:cx="http://schemas.microsoft.com/office/drawing/2014/chartex" xmlns:cx1="http://schemas.microsoft.com/office/drawing/2015/9/8/chartex" xmlns:cx2="http://schemas.microsoft.com/office/drawing/2015/10/21/chartex" xmlns:cx3="http://schemas.microsoft.com/office/drawing/2016/5/9/chartex" xmlns:cx4="http://schemas.microsoft.com/office/drawing/2016/5/10/chartex" xmlns:cx5="http://schemas.microsoft.com/office/drawing/2016/5/11/chartex" xmlns:cx6="http://schemas.microsoft.com/office/drawing/2016/5/12/chartex" xmlns:cx7="http://schemas.microsoft.com/office/drawing/2016/5/13/chartex" xmlns:cx8="http://schemas.microsoft.com/office/drawing/2016/5/14/chartex" xmlns:mc="http://schemas.openxmlformats.org/markup-compatibility/2006" xmlns:aink="http://schemas.microsoft.com/office/drawing/2016/ink" xmlns:am3d="http://schemas.microsoft.com/office/drawing/2017/model3d" xmlns:o="urn:schemas-microsoft-com:office:office" xmlns:oel="http://schemas.microsoft.com/office/2019/extlst" xmlns:r="http://schemas.openxmlformats.org/officeDocument/2006/relationships" xmlns:m="http://schemas.openxmlformats.org/officeDocument/2006/math" xmlns:v="urn:schemas-microsoft-com:vml" xmlns:wp14="http://schemas.microsoft.com/office/word/2010/wordprocessingDrawing" xmlns:wp="http://schemas.openxmlformats.org/drawingml/2006/wordprocessingDrawing" xmlns:w10="urn:schemas-microsoft-com:office:word" xmlns:w="http://schemas.openxmlformats.org/wordprocessingml/2006/main" xmlns:w14="http://schemas.microsoft.com/office/word/2010/wordml" xmlns:w15="http://schemas.microsoft.com/office/word/2012/wordml" xmlns:w16cex="http://schemas.microsoft.com/office/word/2018/wordml/cex" xmlns:w16cid="http://schemas.microsoft.com/office/word/2016/wordml/cid" xmlns:w16="http://schemas.microsoft.com/office/word/2018/wordml" xmlns:w16du="http://schemas.microsoft.com/office/word/2023/wordml/word16du" xmlns:w16sdtdh="http://schemas.microsoft.com/office/word/2020/wordml/sdtdatahash" xmlns:w16sdtfl="http://schemas.microsoft.com/office/word/2024/wordml/sdtformatlock" xmlns:w16se="http://schemas.microsoft.com/office/word/2015/wordml/symex" xmlns:wpg="http://schemas.microsoft.com/office/word/2010/wordprocessingGroup" xmlns:wpi="http://schemas.microsoft.com/office/word/2010/wordprocessingInk" xmlns:wne="http://schemas.microsoft.com/office/word/2006/wordml" xmlns:wps="http://schemas.microsoft.com/office/word/2010/wordprocessingShape" mc:Ignorable="w14 w15 w16se w16cid w16 w16cex w16sdtdh w16sdtfl w16du wp14">
   <w16cid:commentId w16cid:paraId="70AB9F2B" w16cid:durableId="622E673C"/>
+  <w16cid:commentId w16cid:paraId="02791D38" w16cid:durableId="50345F35"/>
   <w16cid:commentId w16cid:paraId="1EBBB4BC" w16cid:durableId="74002062"/>
   <w16cid:commentId w16cid:paraId="65320F05" w16cid:durableId="6A4F022F"/>
 </w16cid:commentsIds>

</xml_diff>